<commit_message>
cập nhật mẫu file
</commit_message>
<xml_diff>
--- a/template.docx
+++ b/template.docx
@@ -136,7 +136,7 @@
                 </mc:Choice>
                 <mc:Fallback>
                   <w:pict>
-                    <v:rect id="_x0000_s1026" o:spid="_x0000_s1026" o:spt="1" style="position:absolute;left:0pt;margin-left:0.5pt;margin-top:6.2pt;height:70.6pt;width:93.55pt;z-index:251659264;v-text-anchor:middle;mso-width-relative:page;mso-height-relative:page;" filled="t" stroked="f" coordsize="21600,21600" o:gfxdata="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">
+                    <v:rect id="_x0000_s1026" o:spid="_x0000_s1026" o:spt="1" style="position:absolute;left:0pt;margin-left:0.5pt;margin-top:6.2pt;height:70.6pt;width:93.55pt;z-index:251659264;v-text-anchor:middle;mso-width-relative:page;mso-height-relative:page;" filled="t" stroked="f" coordsize="21600,21600" o:gfxdata="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">
                       <v:fill type="frame" on="t" focussize="0,0" recolor="t" rotate="t" r:id="rId4"/>
                       <v:stroke on="f" weight="2pt"/>
                       <v:imagedata o:title=""/>
@@ -798,7 +798,7 @@
                 </mc:Choice>
                 <mc:Fallback>
                   <w:pict>
-                    <v:rect id="_x0000_s1026" o:spid="_x0000_s1026" o:spt="1" style="position:absolute;left:0pt;margin-left:0.65pt;margin-top:13.8pt;height:64.35pt;width:77pt;z-index:251660288;v-text-anchor:middle;mso-width-relative:page;mso-height-relative:page;" filled="t" stroked="f" coordsize="21600,21600" o:gfxdata="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">
+                    <v:rect id="_x0000_s1026" o:spid="_x0000_s1026" o:spt="1" style="position:absolute;left:0pt;margin-left:0.65pt;margin-top:13.8pt;height:64.35pt;width:77pt;z-index:251660288;v-text-anchor:middle;mso-width-relative:page;mso-height-relative:page;" filled="t" stroked="f" coordsize="21600,21600" o:gfxdata="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">
                       <v:fill type="frame" on="t" focussize="0,0" recolor="t" rotate="t" r:id="rId5"/>
                       <v:stroke on="f" weight="2pt"/>
                       <v:imagedata o:title=""/>
@@ -838,7 +838,7 @@
         <w:bidi w:val="0"/>
         <w:adjustRightInd/>
         <w:snapToGrid/>
-        <w:spacing w:before="0" w:beforeLines="150"/>
+        <w:spacing w:before="0" w:beforeLines="150" w:after="0"/>
         <w:ind w:left="0" w:right="0"/>
         <w:jc w:val="center"/>
         <w:textAlignment w:val="auto"/>
@@ -852,98 +852,16 @@
       </w:pPr>
       <w:r>
         <w:rPr>
+          <w:rFonts w:hint="default" w:cs="Times New Roman"/>
           <w:b/>
-          <w:sz w:val="26"/>
-          <w:szCs w:val="26"/>
-        </w:rPr>
-        <w:t>PHIẾU</w:t>
-      </w:r>
-      <w:r>
-        <w:rPr>
-          <w:b/>
-          <w:spacing w:val="-3"/>
-          <w:sz w:val="26"/>
-          <w:szCs w:val="26"/>
-        </w:rPr>
-        <w:t xml:space="preserve"> </w:t>
-      </w:r>
-      <w:r>
-        <w:rPr>
-          <w:b/>
-          <w:sz w:val="26"/>
-          <w:szCs w:val="26"/>
-        </w:rPr>
-        <w:t>XUẤT</w:t>
-      </w:r>
-      <w:r>
-        <w:rPr>
-          <w:b/>
-          <w:spacing w:val="-2"/>
-          <w:sz w:val="26"/>
-          <w:szCs w:val="26"/>
-        </w:rPr>
-        <w:t xml:space="preserve"> </w:t>
-      </w:r>
-      <w:r>
-        <w:rPr>
-          <w:b/>
-          <w:sz w:val="26"/>
-          <w:szCs w:val="26"/>
-        </w:rPr>
-        <w:t>KHO</w:t>
-      </w:r>
-      <w:r>
-        <w:rPr>
-          <w:b/>
-          <w:spacing w:val="-2"/>
-          <w:sz w:val="26"/>
-          <w:szCs w:val="26"/>
-        </w:rPr>
-        <w:t xml:space="preserve"> </w:t>
-      </w:r>
-      <w:r>
-        <w:rPr>
-          <w:b/>
-          <w:sz w:val="26"/>
-          <w:szCs w:val="26"/>
-        </w:rPr>
-        <w:t>KIÊM</w:t>
-      </w:r>
-      <w:r>
-        <w:rPr>
-          <w:b/>
-          <w:spacing w:val="-3"/>
-          <w:sz w:val="26"/>
-          <w:szCs w:val="26"/>
-        </w:rPr>
-        <w:t xml:space="preserve"> </w:t>
-      </w:r>
-      <w:r>
-        <w:rPr>
-          <w:b/>
-          <w:sz w:val="26"/>
-          <w:szCs w:val="26"/>
-        </w:rPr>
-        <w:t>BẢO</w:t>
-      </w:r>
-      <w:r>
-        <w:rPr>
-          <w:b/>
-          <w:spacing w:val="-1"/>
-          <w:sz w:val="26"/>
-          <w:szCs w:val="26"/>
-        </w:rPr>
-        <w:t xml:space="preserve"> </w:t>
-      </w:r>
-      <w:r>
-        <w:rPr>
-          <w:b/>
-          <w:spacing w:val="-4"/>
-          <w:sz w:val="26"/>
-          <w:szCs w:val="26"/>
-        </w:rPr>
-        <w:t>HÀNH</w:t>
-      </w:r>
+          <w:sz w:val="24"/>
+          <w:szCs w:val="24"/>
+          <w:lang w:val="en-US"/>
+        </w:rPr>
+        <w:t>PHIẾU XUẤT KHO KIÊM BẢO HÀNH</w:t>
+      </w:r>
+      <w:bookmarkStart w:id="0" w:name="_GoBack"/>
+      <w:bookmarkEnd w:id="0"/>
       <w:r>
         <w:rPr>
           <w:rFonts w:hint="default"/>
@@ -953,7 +871,7 @@
           <w:szCs w:val="26"/>
           <w:lang w:val="en-US"/>
         </w:rPr>
-        <w:t xml:space="preserve">         </w:t>
+        <w:t xml:space="preserve">   </w:t>
       </w:r>
     </w:p>
     <w:p>
@@ -1308,7 +1226,6 @@
           <w:lang w:val="en-US"/>
         </w:rPr>
         <w:tab/>
-        <w:t/>
       </w:r>
       <w:r>
         <w:rPr>
@@ -1320,7 +1237,6 @@
           <w:lang w:val="en-US"/>
         </w:rPr>
         <w:tab/>
-        <w:t/>
       </w:r>
       <w:r>
         <w:rPr>
@@ -1332,6 +1248,16 @@
           <w:lang w:val="en-US"/>
         </w:rPr>
         <w:tab/>
+      </w:r>
+      <w:r>
+        <w:rPr>
+          <w:rFonts w:hint="default"/>
+          <w:b w:val="0"/>
+          <w:bCs/>
+          <w:spacing w:val="0"/>
+          <w:sz w:val="24"/>
+          <w:lang w:val="en-US"/>
+        </w:rPr>
         <w:t>MST: 103860387</w:t>
       </w:r>
     </w:p>
@@ -1846,8 +1772,6 @@
               </w:rPr>
               <w:t>1</w:t>
             </w:r>
-            <w:bookmarkStart w:id="0" w:name="_GoBack"/>
-            <w:bookmarkEnd w:id="0"/>
           </w:p>
         </w:tc>
         <w:tc>
@@ -3153,7 +3077,7 @@
     <w:lsdException w:uiPriority="99" w:name="Body Text Indent 2"/>
     <w:lsdException w:uiPriority="99" w:name="Body Text Indent 3"/>
     <w:lsdException w:uiPriority="99" w:name="Block Text"/>
-    <w:lsdException w:uiPriority="99" w:name="Hyperlink"/>
+    <w:lsdException w:qFormat="1" w:uiPriority="99" w:name="Hyperlink"/>
     <w:lsdException w:uiPriority="99" w:name="FollowedHyperlink"/>
     <w:lsdException w:qFormat="1" w:unhideWhenUsed="0" w:uiPriority="22" w:semiHidden="0" w:name="Strong"/>
     <w:lsdException w:qFormat="1" w:unhideWhenUsed="0" w:uiPriority="20" w:semiHidden="0" w:name="Emphasis"/>
@@ -3388,6 +3312,7 @@
     <w:basedOn w:val="3"/>
     <w:semiHidden/>
     <w:unhideWhenUsed/>
+    <w:qFormat/>
     <w:uiPriority w:val="99"/>
     <w:rPr>
       <w:color w:val="0000FF"/>

</xml_diff>